<commit_message>
Remove the new-business-segment opportunity sentence.
Keep the following details on learning new commercial and financial material, independent research, and structured discussion with the supervisor.

Co-authored-by: Reze13omb <Reze13omb@users.noreply.github.com>
</commit_message>
<xml_diff>
--- a/recommendation_letter/RL_Bo_Zhang_package_zh_en.docx
+++ b/recommendation_letter/RL_Bo_Zhang_package_zh_en.docx
@@ -361,7 +361,7 @@
           <w:color w:val="000000"/>
           <w:sz w:val="24"/>
         </w:rPr>
-        <w:t>He later joined the development of a new business segment. Much of the commercial and financial content was new to him, so the learning demand was high. He did not wait to be walked through the material. He took the initiative to study the segment’s positioning and objectives, our service details, and the competitive environment. When he encountered a problem he could not resolve on his own, he came to me with structured notes, a clear account of what he already understood, and specific questions. As I came to know his working style, I also saw that he would use the data he had assembled to form his own preliminary views and then discuss them with me. Those ideas were still developing, but they showed sound logical thinking and a genuine willingness to go deeper than the assigned task required.</w:t>
+        <w:t>Much of the commercial and financial content was new to him, so the learning demand was high. He did not wait to be walked through the material. He took the initiative to study the business positioning and objectives, our service details, and the competitive environment. When he encountered a problem he could not resolve on his own, he came to me with structured notes, a clear account of what he already understood, and specific questions. As I came to know his working style, I also saw that he would use the data he had assembled to form his own preliminary views and then discuss them with me. Those ideas were still developing, but they showed sound logical thinking and a genuine willingness to go deeper than the assigned task required.</w:t>
       </w:r>
     </w:p>
     <w:p>
@@ -590,7 +590,7 @@
           <w:color w:val="000000"/>
           <w:sz w:val="24"/>
         </w:rPr>
-        <w:t>此后，他参与了一个新业务板块的开发。其中大量业务与财务内容对他而言都是新的，学习压力不小。他没有等待别人带着走，而是主动研究该板块的定位与目标、我们的服务细节以及竞争环境。遇到自己无法独立解决的问题，他会带着结构清晰的笔记、对自己已知内容的说明，以及具体问题来找我。随着我逐渐了解他的工作方式，我也看到他会在已整理的数据基础上形成自己的初步判断，再与我讨论。这些想法当时仍在发展中，但已经体现出扎实的逻辑思维，以及愿意把问题想得比任务本身更深一层的态度。</w:t>
+        <w:t>此后，大量业务与财务内容对他而言都是新的，学习压力不小。他没有等待别人带着走，而是主动研究业务定位与目标、我们的服务细节以及竞争环境。遇到自己无法独立解决的问题，他会带着结构清晰的笔记、对自己已知内容的说明，以及具体问题来找我。随着我逐渐了解他的工作方式，我也看到他会在已整理的数据基础上形成自己的初步判断，再与我讨论。这些想法当时仍在发展中，但已经体现出扎实的逻辑思维，以及愿意把问题想得比任务本身更深一层的态度。</w:t>
       </w:r>
     </w:p>
     <w:p>

</xml_diff>

<commit_message>
Add PCB research and independently written industry report.
Use the applicant-confirmed example: independently gathered PCB and PCB-drill-bit sources, then wrote an industry report and a full written draft.

Co-authored-by: Reze13omb <Reze13omb@users.noreply.github.com>
</commit_message>
<xml_diff>
--- a/recommendation_letter/RL_Bo_Zhang_package_zh_en.docx
+++ b/recommendation_letter/RL_Bo_Zhang_package_zh_en.docx
@@ -361,7 +361,7 @@
           <w:color w:val="000000"/>
           <w:sz w:val="24"/>
         </w:rPr>
-        <w:t>Much of the commercial and financial content was new to him, so the learning demand was high. He did not wait to be walked through the material. He took the initiative to study the business positioning and objectives, our service details, and the competitive environment. When he encountered a problem he could not resolve on his own, he came to me with structured notes, a clear account of what he already understood, and specific questions. As I came to know his working style, I also saw that he would use the data he had assembled to form his own preliminary views and then discuss them with me. Those ideas were still developing, but they showed sound logical thinking and a genuine willingness to go deeper than the assigned task required.</w:t>
+        <w:t>Much of the commercial and financial content was new to him, so the learning demand was high. He did not wait to be walked through the material. On his own, he gathered sources on the PCB industry and on PCB drill bits, then used them to work out the business positioning and objectives, our service details, and the competitive environment. Working independently, he wrote an industry report and a full written draft that turned those materials into a coherent narrative. When he encountered a problem he could not resolve on his own, he came to me with structured notes, a clear account of what he already understood, and specific questions. As I came to know his working style, I also saw that he would use the data he had assembled to form his own preliminary views and then discuss them with me. Those ideas were still developing, but they showed sound logical thinking and a genuine willingness to go deeper than the assigned task required.</w:t>
       </w:r>
     </w:p>
     <w:p>
@@ -590,7 +590,7 @@
           <w:color w:val="000000"/>
           <w:sz w:val="24"/>
         </w:rPr>
-        <w:t>此后，大量业务与财务内容对他而言都是新的，学习压力不小。他没有等待别人带着走，而是主动研究业务定位与目标、我们的服务细节以及竞争环境。遇到自己无法独立解决的问题，他会带着结构清晰的笔记、对自己已知内容的说明，以及具体问题来找我。随着我逐渐了解他的工作方式，我也看到他会在已整理的数据基础上形成自己的初步判断，再与我讨论。这些想法当时仍在发展中，但已经体现出扎实的逻辑思维，以及愿意把问题想得比任务本身更深一层的态度。</w:t>
+        <w:t>此后，大量业务与财务内容对他而言都是新的，学习压力不小。他没有等待别人带着走，而是独立查找PCB及PCB钻头相关资料，并据此梳理业务定位与目标、我们的服务细节以及竞争环境。随后，他又独立完成了一份行业报告和文字底稿，把这些材料写成条理清楚的叙述。遇到自己无法独立解决的问题，他会带着结构清晰的笔记、对自己已知内容的说明，以及具体问题来找我。随着我逐渐了解他的工作方式，我也看到他会在已整理的数据基础上形成自己的初步判断，再与我讨论。这些想法当时仍在发展中，但已经体现出扎实的逻辑思维，以及愿意把问题想得比任务本身更深一层的态度。</w:t>
       </w:r>
     </w:p>
     <w:p>

</xml_diff>